<commit_message>
Add De Conciliis II.19 to the Bellarmine entry; reclassify 1/2 -> 1
'Dubius papa habetur pro non papa'; the schism-time competence; and
the Martin V sentence - 'quem omnis Ecclesia ut verum pontificem
venerabatur, id quod sufficit, ut Martinus esse posset verus papa.'
Plus the resist-corrective. Print-verified, Naples vol. II p. 71.

Co-Authored-By: Claude Fable 5 <noreply@anthropic.com>
Claude-Session: https://claude.ai/code/session_01EkKuzE7zQ3m7joz3G9Gvfo
</commit_message>
<xml_diff>
--- a/1588 Bellarmine/1588_Bellarmine_EN.docx
+++ b/1588 Bellarmine/1588_Bellarmine_EN.docx
@@ -493,6 +493,56 @@
       </w:r>
     </w:p>
     <w:bookmarkEnd w:id="21"/>
+    <w:bookmarkStart w:id="22" w:name="X2e39d725b38f61f31fce219ffdd3acb271fffb0"/>
+    <w:p>
+      <w:pPr>
+        <w:pStyle w:val="Heading2"/>
+      </w:pPr>
+      <w:r>
+        <w:t xml:space="preserve">De Conciliis, Book II, Chapter XIX — The adversaries’ arguments resolved: Constance, the doubtful pope, and Martin V (Naples ed., vol. II, p. 71)</w:t>
+      </w:r>
+    </w:p>
+    <w:p>
+      <w:pPr>
+        <w:pStyle w:val="FirstParagraph"/>
+      </w:pPr>
+      <w:r>
+        <w:t xml:space="preserve">The third argument of Gerson, related by Hermann, is taken from the council of Constance. The council of Constance, session 4, defined that a general council has immediate authority from Christ, which all are bound to obey, even one of papal dignity. Either this council is approved, or not: if it is approved, then what it defined is true and to be received; if not, then it wrongly deposed John XXIII, Gregory XII, and Benedict XIII, and elected Martin V — whom all the other pontiffs afterwards succeeded. Add that Pope Martin V in the last session confirmed all the decrees of this council of Constance concerning the faith: and this decree seems to pertain to the faith.</w:t>
+      </w:r>
+    </w:p>
+    <w:p>
+      <w:pPr>
+        <w:pStyle w:val="BodyText"/>
+      </w:pPr>
+      <w:r>
+        <w:t xml:space="preserve">I reply in two ways. First: the council of Constance is legitimate and approved, but does not conflict with what we have said. For it did not define absolutely that general councils have power from Christ over pontiffs, but only in a certain case — that is, in time of schism, when it is not known who is the true pope. For a doubtful pope is held as no pope; and therefore to have power over him is not to have power over a pope. So Torquemada, Campeggi, and Sander in the places noted.</w:t>
+      </w:r>
+    </w:p>
+    <w:p>
+      <w:pPr>
+        <w:pStyle w:val="BodyText"/>
+      </w:pPr>
+      <w:r>
+        <w:t xml:space="preserve">Second, it can be replied that the council of Constance, when it asserted such a thing, was not of the kind that could define questions of faith; for in the first place it was not then a general council, since only a third part of the Church was present — that is, only those prelates who obeyed John; for those who obeyed Gregory and Benedict opposed the things being done by the synod. Moreover, there was not then a certain pope in the Church, without whom doubtful matters of faith cannot be defined; and in the council there was no pope: for John XXIII, who had begun the council, had already withdrawn from it when the fourth session was held.</w:t>
+      </w:r>
+    </w:p>
+    <w:p>
+      <w:pPr>
+        <w:pStyle w:val="BodyText"/>
+      </w:pPr>
+      <w:r>
+        <w:t xml:space="preserve">Nor does it follow that, if the council erred in this, it erred also in deposing Gregory XII, John XXIII, and Benedict XIII. For although a council without a pope cannot define new dogmas of faith, it can nevertheless judge, in time of schism, who is the true pope, and provide the Church with a true pastor when there is none, or a doubtful one; and this is what the council of Constance rightly did. Add that John and Gregory were not deposed unwillingly, for they also freely renounced the papacy, as appears from the acts of the council of Constance, sessions 12 and 14. But Benedict did not yield; after his death, however, Clement VIII his successor yielded to Martin V — whom the whole Church venerated as true pontiff, which suffices for Martin to have been able to be true pope.</w:t>
+      </w:r>
+    </w:p>
+    <w:p>
+      <w:pPr>
+        <w:pStyle w:val="BodyText"/>
+      </w:pPr>
+      <w:r>
+        <w:t xml:space="preserve">[From the same chapter, answering the preceding argument:] But, they say, then the Church alone remains without remedy, if she has a bad pontiff; and the pontiff will be able to harass and ruin everyone with impunity, and no one will be able to resist. I reply: it is no wonder if the Church remains without an efficacious human remedy, since her salvation does not rest principally on human industry but on divine protection, since her king is God. And so, even if the Church cannot depose a pontiff, she can and ought to supplicate the Lord to apply a remedy Himself; and it is certain that God will have care of her salvation — that He will either convert such a pontiff, or remove him from the midst, before he destroys the Church. Nor does it follow from this that it is not lawful to resist a pontiff who is destroying the Church; for it is lawful, with due reverence preserved, to admonish him and modestly correct him, and even to resist him with force and arms, if he should wish to destroy the Church. For to resist, and to repel force with force, no authority is required. See on this matter John of Torquemada, book 2, chapter 106.</w:t>
+      </w:r>
+    </w:p>
+    <w:bookmarkEnd w:id="22"/>
     <w:sectPr/>
   </w:body>
 </w:document>

</xml_diff>